<commit_message>
update report - fix table of contents and page numbers
</commit_message>
<xml_diff>
--- a/Pneumonia_Detection_Final_Report.docx
+++ b/Pneumonia_Detection_Final_Report.docx
@@ -220,9 +220,14 @@
       </w:r>
     </w:p>
     <w:p>
-      <w:r>
-        <w:br w:type="page"/>
-      </w:r>
+      <w:pPr>
+        <w:sectPr>
+          <w:pgSz w:w="11906" w:h="16838" w:orient="portrait"/>
+          <w:pgMar w:top="1440" w:right="1440" w:bottom="1440" w:left="1440" w:header="708" w:footer="708" w:gutter="0"/>
+          <w:pgNumType w:start="1" w:fmt="lowerRoman"/>
+          <w:docGrid w:linePitch="360"/>
+        </w:sectPr>
+      </w:pPr>
     </w:p>
     <w:p>
       <w:pPr>
@@ -283,16 +288,13 @@
       </w:pPr>
       <w:r>
         <w:rPr>
-          <w:sz w:val="24"/>
-          <w:szCs w:val="24"/>
-          <w:rFonts w:ascii="Times New Roman" w:cs="Times New Roman" w:eastAsia="Times New Roman" w:hAnsi="Times New Roman"/>
-        </w:rPr>
-        <w:t xml:space="preserve">&lt;Project Guide's name&gt;	&lt;Coordinator's name&gt;</w:t>
-      </w:r>
-    </w:p>
-    <w:p>
-      <w:r>
-        <w:t xml:space="preserve"/>
+          <w:b/>
+          <w:bCs/>
+          <w:sz w:val="24"/>
+          <w:szCs w:val="24"/>
+          <w:rFonts w:ascii="Times New Roman" w:cs="Times New Roman" w:eastAsia="Times New Roman" w:hAnsi="Times New Roman"/>
+        </w:rPr>
+        <w:t xml:space="preserve">Project Guide	Coordinator</w:t>
       </w:r>
     </w:p>
     <w:p>
@@ -311,7 +313,7 @@
           <w:szCs w:val="24"/>
           <w:rFonts w:ascii="Times New Roman" w:cs="Times New Roman" w:eastAsia="Times New Roman" w:hAnsi="Times New Roman"/>
         </w:rPr>
-        <w:t xml:space="preserve">Reviewer</w:t>
+        <w:t xml:space="preserve">Place:</w:t>
       </w:r>
     </w:p>
     <w:p>
@@ -391,30 +393,34 @@
     </w:p>
     <w:p>
       <w:pPr>
-        <w:jc w:val="right"/>
-      </w:pPr>
-      <w:r>
-        <w:rPr>
-          <w:sz w:val="24"/>
-          <w:szCs w:val="24"/>
-          <w:rFonts w:ascii="Times New Roman" w:cs="Times New Roman" w:eastAsia="Times New Roman" w:hAnsi="Times New Roman"/>
-        </w:rPr>
-        <w:t xml:space="preserve">&lt;Signature of the student&gt;</w:t>
-      </w:r>
-    </w:p>
-    <w:p>
-      <w:pPr>
         <w:tabs>
           <w:tab w:val="right" w:pos="9026"/>
         </w:tabs>
       </w:pPr>
       <w:r>
         <w:rPr>
-          <w:sz w:val="24"/>
-          <w:szCs w:val="24"/>
-          <w:rFonts w:ascii="Times New Roman" w:cs="Times New Roman" w:eastAsia="Times New Roman" w:hAnsi="Times New Roman"/>
-        </w:rPr>
-        <w:t xml:space="preserve">Date:	DAMARAPARAPU KRISHNA PAVANI</w:t>
+          <w:b/>
+          <w:bCs/>
+          <w:sz w:val="24"/>
+          <w:szCs w:val="24"/>
+          <w:rFonts w:ascii="Times New Roman" w:cs="Times New Roman" w:eastAsia="Times New Roman" w:hAnsi="Times New Roman"/>
+        </w:rPr>
+        <w:t xml:space="preserve">	DAMARAPARAPU KRISHNA PAVANI</w:t>
+      </w:r>
+    </w:p>
+    <w:p>
+      <w:pPr>
+        <w:tabs>
+          <w:tab w:val="right" w:pos="9026"/>
+        </w:tabs>
+      </w:pPr>
+      <w:r>
+        <w:rPr>
+          <w:sz w:val="24"/>
+          <w:szCs w:val="24"/>
+          <w:rFonts w:ascii="Times New Roman" w:cs="Times New Roman" w:eastAsia="Times New Roman" w:hAnsi="Times New Roman"/>
+        </w:rPr>
+        <w:t xml:space="preserve">Date:	Place:</w:t>
       </w:r>
     </w:p>
     <w:p>
@@ -613,38 +619,728 @@
         <w:t xml:space="preserve"/>
       </w:r>
     </w:p>
-    <w:sdt>
-      <w:sdtPr>
-        <w:alias w:val="Table of Contents"/>
-      </w:sdtPr>
-      <w:sdtContent>
-        <w:p>
-          <w:r>
-            <w:fldChar w:fldCharType="begin" w:dirty="true"/>
-            <w:instrText xml:space="preserve">TOC \h \o "1-2"</w:instrText>
-            <w:fldChar w:fldCharType="separate"/>
-          </w:r>
-        </w:p>
-        <w:p>
-          <w:r>
-            <w:fldChar w:fldCharType="end"/>
-          </w:r>
-        </w:p>
-      </w:sdtContent>
-    </w:sdt>
-    <w:p>
-      <w:pPr>
-        <w:spacing w:before="120"/>
+    <w:p>
+      <w:pPr>
+        <w:spacing w:after="80" w:line="300" w:before="100"/>
+      </w:pPr>
+      <w:r>
+        <w:rPr>
+          <w:b/>
+          <w:bCs/>
+          <w:sz w:val="24"/>
+          <w:szCs w:val="24"/>
+          <w:rFonts w:ascii="Times New Roman" w:cs="Times New Roman" w:eastAsia="Times New Roman" w:hAnsi="Times New Roman"/>
+        </w:rPr>
+        <w:t xml:space="preserve">Abstract</w:t>
+      </w:r>
+    </w:p>
+    <w:p>
+      <w:pPr>
+        <w:spacing w:after="80" w:line="300" w:before="100"/>
+      </w:pPr>
+      <w:r>
+        <w:rPr>
+          <w:b/>
+          <w:bCs/>
+          <w:sz w:val="24"/>
+          <w:szCs w:val="24"/>
+          <w:rFonts w:ascii="Times New Roman" w:cs="Times New Roman" w:eastAsia="Times New Roman" w:hAnsi="Times New Roman"/>
+        </w:rPr>
+        <w:t xml:space="preserve">List of Figures</w:t>
+      </w:r>
+    </w:p>
+    <w:p>
+      <w:pPr>
+        <w:spacing w:after="80" w:line="300" w:before="100"/>
+      </w:pPr>
+      <w:r>
+        <w:rPr>
+          <w:b/>
+          <w:bCs/>
+          <w:sz w:val="24"/>
+          <w:szCs w:val="24"/>
+          <w:rFonts w:ascii="Times New Roman" w:cs="Times New Roman" w:eastAsia="Times New Roman" w:hAnsi="Times New Roman"/>
+        </w:rPr>
+        <w:t xml:space="preserve">List of Tables</w:t>
+      </w:r>
+    </w:p>
+    <w:p>
+      <w:pPr>
+        <w:spacing w:after="80" w:line="300" w:before="100"/>
+      </w:pPr>
+      <w:r>
+        <w:rPr>
+          <w:b/>
+          <w:bCs/>
+          <w:sz w:val="24"/>
+          <w:szCs w:val="24"/>
+          <w:rFonts w:ascii="Times New Roman" w:cs="Times New Roman" w:eastAsia="Times New Roman" w:hAnsi="Times New Roman"/>
+        </w:rPr>
+        <w:t xml:space="preserve">List of Abbreviations</w:t>
+      </w:r>
+    </w:p>
+    <w:p>
+      <w:pPr>
+        <w:spacing w:after="80" w:line="300" w:before="100"/>
+      </w:pPr>
+      <w:r>
+        <w:rPr>
+          <w:b/>
+          <w:bCs/>
+          <w:sz w:val="24"/>
+          <w:szCs w:val="24"/>
+          <w:rFonts w:ascii="Times New Roman" w:cs="Times New Roman" w:eastAsia="Times New Roman" w:hAnsi="Times New Roman"/>
+        </w:rPr>
+        <w:t xml:space="preserve">Chapter 1  Introduction</w:t>
+      </w:r>
+    </w:p>
+    <w:p>
+      <w:pPr>
+        <w:spacing w:after="20" w:line="300" w:before="0"/>
+        <w:ind w:left="420"/>
+      </w:pPr>
+      <w:r>
+        <w:rPr>
+          <w:b w:val="false"/>
+          <w:bCs w:val="false"/>
+          <w:sz w:val="22"/>
+          <w:szCs w:val="22"/>
+          <w:rFonts w:ascii="Times New Roman" w:cs="Times New Roman" w:eastAsia="Times New Roman" w:hAnsi="Times New Roman"/>
+        </w:rPr>
+        <w:t xml:space="preserve">1.1  Background and Motivation</w:t>
+      </w:r>
+    </w:p>
+    <w:p>
+      <w:pPr>
+        <w:spacing w:after="20" w:line="300" w:before="0"/>
+        <w:ind w:left="420"/>
+      </w:pPr>
+      <w:r>
+        <w:rPr>
+          <w:b w:val="false"/>
+          <w:bCs w:val="false"/>
+          <w:sz w:val="22"/>
+          <w:szCs w:val="22"/>
+          <w:rFonts w:ascii="Times New Roman" w:cs="Times New Roman" w:eastAsia="Times New Roman" w:hAnsi="Times New Roman"/>
+        </w:rPr>
+        <w:t xml:space="preserve">1.2  Problem Statement</w:t>
+      </w:r>
+    </w:p>
+    <w:p>
+      <w:pPr>
+        <w:spacing w:after="20" w:line="300" w:before="0"/>
+        <w:ind w:left="420"/>
+      </w:pPr>
+      <w:r>
+        <w:rPr>
+          <w:b w:val="false"/>
+          <w:bCs w:val="false"/>
+          <w:sz w:val="22"/>
+          <w:szCs w:val="22"/>
+          <w:rFonts w:ascii="Times New Roman" w:cs="Times New Roman" w:eastAsia="Times New Roman" w:hAnsi="Times New Roman"/>
+        </w:rPr>
+        <w:t xml:space="preserve">1.3  Objectives and Scope</w:t>
+      </w:r>
+    </w:p>
+    <w:p>
+      <w:pPr>
+        <w:spacing w:after="20" w:line="300" w:before="0"/>
+        <w:ind w:left="420"/>
+      </w:pPr>
+      <w:r>
+        <w:rPr>
+          <w:b w:val="false"/>
+          <w:bCs w:val="false"/>
+          <w:sz w:val="22"/>
+          <w:szCs w:val="22"/>
+          <w:rFonts w:ascii="Times New Roman" w:cs="Times New Roman" w:eastAsia="Times New Roman" w:hAnsi="Times New Roman"/>
+        </w:rPr>
+        <w:t xml:space="preserve">1.4  Organization of the Report</w:t>
+      </w:r>
+    </w:p>
+    <w:p>
+      <w:pPr>
+        <w:spacing w:after="80" w:line="300" w:before="100"/>
+      </w:pPr>
+      <w:r>
+        <w:rPr>
+          <w:b/>
+          <w:bCs/>
+          <w:sz w:val="24"/>
+          <w:szCs w:val="24"/>
+          <w:rFonts w:ascii="Times New Roman" w:cs="Times New Roman" w:eastAsia="Times New Roman" w:hAnsi="Times New Roman"/>
+        </w:rPr>
+        <w:t xml:space="preserve">Chapter 2  Literature Review / Background Study</w:t>
+      </w:r>
+    </w:p>
+    <w:p>
+      <w:pPr>
+        <w:spacing w:after="20" w:line="300" w:before="0"/>
+        <w:ind w:left="420"/>
+      </w:pPr>
+      <w:r>
+        <w:rPr>
+          <w:b w:val="false"/>
+          <w:bCs w:val="false"/>
+          <w:sz w:val="22"/>
+          <w:szCs w:val="22"/>
+          <w:rFonts w:ascii="Times New Roman" w:cs="Times New Roman" w:eastAsia="Times New Roman" w:hAnsi="Times New Roman"/>
+        </w:rPr>
+        <w:t xml:space="preserve">2.1  Deep Learning in Medical Image Analysis</w:t>
+      </w:r>
+    </w:p>
+    <w:p>
+      <w:pPr>
+        <w:spacing w:after="20" w:line="300" w:before="0"/>
+        <w:ind w:left="420"/>
+      </w:pPr>
+      <w:r>
+        <w:rPr>
+          <w:b w:val="false"/>
+          <w:bCs w:val="false"/>
+          <w:sz w:val="22"/>
+          <w:szCs w:val="22"/>
+          <w:rFonts w:ascii="Times New Roman" w:cs="Times New Roman" w:eastAsia="Times New Roman" w:hAnsi="Times New Roman"/>
+        </w:rPr>
+        <w:t xml:space="preserve">2.2  Transfer Learning</w:t>
+      </w:r>
+    </w:p>
+    <w:p>
+      <w:pPr>
+        <w:spacing w:after="20" w:line="300" w:before="0"/>
+        <w:ind w:left="420"/>
+      </w:pPr>
+      <w:r>
+        <w:rPr>
+          <w:b w:val="false"/>
+          <w:bCs w:val="false"/>
+          <w:sz w:val="22"/>
+          <w:szCs w:val="22"/>
+          <w:rFonts w:ascii="Times New Roman" w:cs="Times New Roman" w:eastAsia="Times New Roman" w:hAnsi="Times New Roman"/>
+        </w:rPr>
+        <w:t xml:space="preserve">2.3  The DenseNet Architecture</w:t>
+      </w:r>
+    </w:p>
+    <w:p>
+      <w:pPr>
+        <w:spacing w:after="20" w:line="300" w:before="0"/>
+        <w:ind w:left="420"/>
+      </w:pPr>
+      <w:r>
+        <w:rPr>
+          <w:b w:val="false"/>
+          <w:bCs w:val="false"/>
+          <w:sz w:val="22"/>
+          <w:szCs w:val="22"/>
+          <w:rFonts w:ascii="Times New Roman" w:cs="Times New Roman" w:eastAsia="Times New Roman" w:hAnsi="Times New Roman"/>
+        </w:rPr>
+        <w:t xml:space="preserve">2.4  Pneumonia Detection from Chest X-Rays</w:t>
+      </w:r>
+    </w:p>
+    <w:p>
+      <w:pPr>
+        <w:spacing w:after="20" w:line="300" w:before="0"/>
+        <w:ind w:left="420"/>
+      </w:pPr>
+      <w:r>
+        <w:rPr>
+          <w:b w:val="false"/>
+          <w:bCs w:val="false"/>
+          <w:sz w:val="22"/>
+          <w:szCs w:val="22"/>
+          <w:rFonts w:ascii="Times New Roman" w:cs="Times New Roman" w:eastAsia="Times New Roman" w:hAnsi="Times New Roman"/>
+        </w:rPr>
+        <w:t xml:space="preserve">2.5  Explainable AI and Grad-CAM</w:t>
+      </w:r>
+    </w:p>
+    <w:p>
+      <w:pPr>
+        <w:spacing w:after="20" w:line="300" w:before="0"/>
+        <w:ind w:left="420"/>
+      </w:pPr>
+      <w:r>
+        <w:rPr>
+          <w:b w:val="false"/>
+          <w:bCs w:val="false"/>
+          <w:sz w:val="22"/>
+          <w:szCs w:val="22"/>
+          <w:rFonts w:ascii="Times New Roman" w:cs="Times New Roman" w:eastAsia="Times New Roman" w:hAnsi="Times New Roman"/>
+        </w:rPr>
+        <w:t xml:space="preserve">2.6  Research Gap and Justification</w:t>
+      </w:r>
+    </w:p>
+    <w:p>
+      <w:pPr>
+        <w:spacing w:after="80" w:line="300" w:before="100"/>
+      </w:pPr>
+      <w:r>
+        <w:rPr>
+          <w:b/>
+          <w:bCs/>
+          <w:sz w:val="24"/>
+          <w:szCs w:val="24"/>
+          <w:rFonts w:ascii="Times New Roman" w:cs="Times New Roman" w:eastAsia="Times New Roman" w:hAnsi="Times New Roman"/>
+        </w:rPr>
+        <w:t xml:space="preserve">Chapter 3  System Design / Architecture</w:t>
+      </w:r>
+    </w:p>
+    <w:p>
+      <w:pPr>
+        <w:spacing w:after="20" w:line="300" w:before="0"/>
+        <w:ind w:left="420"/>
+      </w:pPr>
+      <w:r>
+        <w:rPr>
+          <w:b w:val="false"/>
+          <w:bCs w:val="false"/>
+          <w:sz w:val="22"/>
+          <w:szCs w:val="22"/>
+          <w:rFonts w:ascii="Times New Roman" w:cs="Times New Roman" w:eastAsia="Times New Roman" w:hAnsi="Times New Roman"/>
+        </w:rPr>
+        <w:t xml:space="preserve">3.1  Overview</w:t>
+      </w:r>
+    </w:p>
+    <w:p>
+      <w:pPr>
+        <w:spacing w:after="20" w:line="300" w:before="0"/>
+        <w:ind w:left="420"/>
+      </w:pPr>
+      <w:r>
+        <w:rPr>
+          <w:b w:val="false"/>
+          <w:bCs w:val="false"/>
+          <w:sz w:val="22"/>
+          <w:szCs w:val="22"/>
+          <w:rFonts w:ascii="Times New Roman" w:cs="Times New Roman" w:eastAsia="Times New Roman" w:hAnsi="Times New Roman"/>
+        </w:rPr>
+        <w:t xml:space="preserve">3.2  Data Flow</w:t>
+      </w:r>
+    </w:p>
+    <w:p>
+      <w:pPr>
+        <w:spacing w:after="20" w:line="300" w:before="0"/>
+        <w:ind w:left="420"/>
+      </w:pPr>
+      <w:r>
+        <w:rPr>
+          <w:b w:val="false"/>
+          <w:bCs w:val="false"/>
+          <w:sz w:val="22"/>
+          <w:szCs w:val="22"/>
+          <w:rFonts w:ascii="Times New Roman" w:cs="Times New Roman" w:eastAsia="Times New Roman" w:hAnsi="Times New Roman"/>
+        </w:rPr>
+        <w:t xml:space="preserve">3.3  Module Descriptions</w:t>
+      </w:r>
+    </w:p>
+    <w:p>
+      <w:pPr>
+        <w:spacing w:after="20" w:line="300" w:before="0"/>
+        <w:ind w:left="420"/>
+      </w:pPr>
+      <w:r>
+        <w:rPr>
+          <w:b w:val="false"/>
+          <w:bCs w:val="false"/>
+          <w:sz w:val="22"/>
+          <w:szCs w:val="22"/>
+          <w:rFonts w:ascii="Times New Roman" w:cs="Times New Roman" w:eastAsia="Times New Roman" w:hAnsi="Times New Roman"/>
+        </w:rPr>
+        <w:t xml:space="preserve">3.4  Programming Environment</w:t>
+      </w:r>
+    </w:p>
+    <w:p>
+      <w:pPr>
+        <w:spacing w:after="20" w:line="300" w:before="0"/>
+        <w:ind w:left="420"/>
+      </w:pPr>
+      <w:r>
+        <w:rPr>
+          <w:b w:val="false"/>
+          <w:bCs w:val="false"/>
+          <w:sz w:val="22"/>
+          <w:szCs w:val="22"/>
+          <w:rFonts w:ascii="Times New Roman" w:cs="Times New Roman" w:eastAsia="Times New Roman" w:hAnsi="Times New Roman"/>
+        </w:rPr>
+        <w:t xml:space="preserve">3.5  Core Algorithm (Pseudocode)</w:t>
+      </w:r>
+    </w:p>
+    <w:p>
+      <w:pPr>
+        <w:spacing w:after="80" w:line="300" w:before="100"/>
+      </w:pPr>
+      <w:r>
+        <w:rPr>
+          <w:b/>
+          <w:bCs/>
+          <w:sz w:val="24"/>
+          <w:szCs w:val="24"/>
+          <w:rFonts w:ascii="Times New Roman" w:cs="Times New Roman" w:eastAsia="Times New Roman" w:hAnsi="Times New Roman"/>
+        </w:rPr>
+        <w:t xml:space="preserve">Chapter 4  Implementation Details</w:t>
+      </w:r>
+    </w:p>
+    <w:p>
+      <w:pPr>
+        <w:spacing w:after="20" w:line="300" w:before="0"/>
+        <w:ind w:left="420"/>
+      </w:pPr>
+      <w:r>
+        <w:rPr>
+          <w:b w:val="false"/>
+          <w:bCs w:val="false"/>
+          <w:sz w:val="22"/>
+          <w:szCs w:val="22"/>
+          <w:rFonts w:ascii="Times New Roman" w:cs="Times New Roman" w:eastAsia="Times New Roman" w:hAnsi="Times New Roman"/>
+        </w:rPr>
+        <w:t xml:space="preserve">4.1  Data Preprocessing and Augmentation</w:t>
+      </w:r>
+    </w:p>
+    <w:p>
+      <w:pPr>
+        <w:spacing w:after="20" w:line="300" w:before="0"/>
+        <w:ind w:left="420"/>
+      </w:pPr>
+      <w:r>
+        <w:rPr>
+          <w:b w:val="false"/>
+          <w:bCs w:val="false"/>
+          <w:sz w:val="22"/>
+          <w:szCs w:val="22"/>
+          <w:rFonts w:ascii="Times New Roman" w:cs="Times New Roman" w:eastAsia="Times New Roman" w:hAnsi="Times New Roman"/>
+        </w:rPr>
+        <w:t xml:space="preserve">4.2  Model Construction</w:t>
+      </w:r>
+    </w:p>
+    <w:p>
+      <w:pPr>
+        <w:spacing w:after="20" w:line="300" w:before="0"/>
+        <w:ind w:left="420"/>
+      </w:pPr>
+      <w:r>
+        <w:rPr>
+          <w:b w:val="false"/>
+          <w:bCs w:val="false"/>
+          <w:sz w:val="22"/>
+          <w:szCs w:val="22"/>
+          <w:rFonts w:ascii="Times New Roman" w:cs="Times New Roman" w:eastAsia="Times New Roman" w:hAnsi="Times New Roman"/>
+        </w:rPr>
+        <w:t xml:space="preserve">4.3  Training</w:t>
+      </w:r>
+    </w:p>
+    <w:p>
+      <w:pPr>
+        <w:spacing w:after="20" w:line="300" w:before="0"/>
+        <w:ind w:left="420"/>
+      </w:pPr>
+      <w:r>
+        <w:rPr>
+          <w:b w:val="false"/>
+          <w:bCs w:val="false"/>
+          <w:sz w:val="22"/>
+          <w:szCs w:val="22"/>
+          <w:rFonts w:ascii="Times New Roman" w:cs="Times New Roman" w:eastAsia="Times New Roman" w:hAnsi="Times New Roman"/>
+        </w:rPr>
+        <w:t xml:space="preserve">4.4  Explainability with Grad-CAM</w:t>
+      </w:r>
+    </w:p>
+    <w:p>
+      <w:pPr>
+        <w:spacing w:after="20" w:line="300" w:before="0"/>
+        <w:ind w:left="420"/>
+      </w:pPr>
+      <w:r>
+        <w:rPr>
+          <w:b w:val="false"/>
+          <w:bCs w:val="false"/>
+          <w:sz w:val="22"/>
+          <w:szCs w:val="22"/>
+          <w:rFonts w:ascii="Times New Roman" w:cs="Times New Roman" w:eastAsia="Times New Roman" w:hAnsi="Times New Roman"/>
+        </w:rPr>
+        <w:t xml:space="preserve">4.5  Inference and the Web Application</w:t>
+      </w:r>
+    </w:p>
+    <w:p>
+      <w:pPr>
+        <w:spacing w:after="20" w:line="300" w:before="0"/>
+        <w:ind w:left="420"/>
+      </w:pPr>
+      <w:r>
+        <w:rPr>
+          <w:b w:val="false"/>
+          <w:bCs w:val="false"/>
+          <w:sz w:val="22"/>
+          <w:szCs w:val="22"/>
+          <w:rFonts w:ascii="Times New Roman" w:cs="Times New Roman" w:eastAsia="Times New Roman" w:hAnsi="Times New Roman"/>
+        </w:rPr>
+        <w:t xml:space="preserve">4.6  Deployment</w:t>
+      </w:r>
+    </w:p>
+    <w:p>
+      <w:pPr>
+        <w:spacing w:after="80" w:line="300" w:before="100"/>
+      </w:pPr>
+      <w:r>
+        <w:rPr>
+          <w:b/>
+          <w:bCs/>
+          <w:sz w:val="24"/>
+          <w:szCs w:val="24"/>
+          <w:rFonts w:ascii="Times New Roman" w:cs="Times New Roman" w:eastAsia="Times New Roman" w:hAnsi="Times New Roman"/>
+        </w:rPr>
+        <w:t xml:space="preserve">Chapter 5  Testing, Validation &amp; Results</w:t>
+      </w:r>
+    </w:p>
+    <w:p>
+      <w:pPr>
+        <w:spacing w:after="20" w:line="300" w:before="0"/>
+        <w:ind w:left="420"/>
+      </w:pPr>
+      <w:r>
+        <w:rPr>
+          <w:b w:val="false"/>
+          <w:bCs w:val="false"/>
+          <w:sz w:val="22"/>
+          <w:szCs w:val="22"/>
+          <w:rFonts w:ascii="Times New Roman" w:cs="Times New Roman" w:eastAsia="Times New Roman" w:hAnsi="Times New Roman"/>
+        </w:rPr>
+        <w:t xml:space="preserve">5.1  Testing Methodology</w:t>
+      </w:r>
+    </w:p>
+    <w:p>
+      <w:pPr>
+        <w:spacing w:after="20" w:line="300" w:before="0"/>
+        <w:ind w:left="420"/>
+      </w:pPr>
+      <w:r>
+        <w:rPr>
+          <w:b w:val="false"/>
+          <w:bCs w:val="false"/>
+          <w:sz w:val="22"/>
+          <w:szCs w:val="22"/>
+          <w:rFonts w:ascii="Times New Roman" w:cs="Times New Roman" w:eastAsia="Times New Roman" w:hAnsi="Times New Roman"/>
+        </w:rPr>
+        <w:t xml:space="preserve">5.2  Evaluation Metrics</w:t>
+      </w:r>
+    </w:p>
+    <w:p>
+      <w:pPr>
+        <w:spacing w:after="20" w:line="300" w:before="0"/>
+        <w:ind w:left="420"/>
+      </w:pPr>
+      <w:r>
+        <w:rPr>
+          <w:b w:val="false"/>
+          <w:bCs w:val="false"/>
+          <w:sz w:val="22"/>
+          <w:szCs w:val="22"/>
+          <w:rFonts w:ascii="Times New Roman" w:cs="Times New Roman" w:eastAsia="Times New Roman" w:hAnsi="Times New Roman"/>
+        </w:rPr>
+        <w:t xml:space="preserve">5.3  Training Behaviour</w:t>
+      </w:r>
+    </w:p>
+    <w:p>
+      <w:pPr>
+        <w:spacing w:after="20" w:line="300" w:before="0"/>
+        <w:ind w:left="420"/>
+      </w:pPr>
+      <w:r>
+        <w:rPr>
+          <w:b w:val="false"/>
+          <w:bCs w:val="false"/>
+          <w:sz w:val="22"/>
+          <w:szCs w:val="22"/>
+          <w:rFonts w:ascii="Times New Roman" w:cs="Times New Roman" w:eastAsia="Times New Roman" w:hAnsi="Times New Roman"/>
+        </w:rPr>
+        <w:t xml:space="preserve">5.4  Confusion Matrix and ROC Curve</w:t>
+      </w:r>
+    </w:p>
+    <w:p>
+      <w:pPr>
+        <w:spacing w:after="20" w:line="300" w:before="0"/>
+        <w:ind w:left="420"/>
+      </w:pPr>
+      <w:r>
+        <w:rPr>
+          <w:b w:val="false"/>
+          <w:bCs w:val="false"/>
+          <w:sz w:val="22"/>
+          <w:szCs w:val="22"/>
+          <w:rFonts w:ascii="Times New Roman" w:cs="Times New Roman" w:eastAsia="Times New Roman" w:hAnsi="Times New Roman"/>
+        </w:rPr>
+        <w:t xml:space="preserve">5.5  Explainability Results</w:t>
+      </w:r>
+    </w:p>
+    <w:p>
+      <w:pPr>
+        <w:spacing w:after="20" w:line="300" w:before="0"/>
+        <w:ind w:left="420"/>
+      </w:pPr>
+      <w:r>
+        <w:rPr>
+          <w:b w:val="false"/>
+          <w:bCs w:val="false"/>
+          <w:sz w:val="22"/>
+          <w:szCs w:val="22"/>
+          <w:rFonts w:ascii="Times New Roman" w:cs="Times New Roman" w:eastAsia="Times New Roman" w:hAnsi="Times New Roman"/>
+        </w:rPr>
+        <w:t xml:space="preserve">5.6  Discussion</w:t>
+      </w:r>
+    </w:p>
+    <w:p>
+      <w:pPr>
+        <w:spacing w:after="80" w:line="300" w:before="100"/>
+      </w:pPr>
+      <w:r>
+        <w:rPr>
+          <w:b/>
+          <w:bCs/>
+          <w:sz w:val="24"/>
+          <w:szCs w:val="24"/>
+          <w:rFonts w:ascii="Times New Roman" w:cs="Times New Roman" w:eastAsia="Times New Roman" w:hAnsi="Times New Roman"/>
+        </w:rPr>
+        <w:t xml:space="preserve">Chapter 6  Conclusion and Future Work</w:t>
+      </w:r>
+    </w:p>
+    <w:p>
+      <w:pPr>
+        <w:spacing w:after="20" w:line="300" w:before="0"/>
+        <w:ind w:left="420"/>
+      </w:pPr>
+      <w:r>
+        <w:rPr>
+          <w:b w:val="false"/>
+          <w:bCs w:val="false"/>
+          <w:sz w:val="22"/>
+          <w:szCs w:val="22"/>
+          <w:rFonts w:ascii="Times New Roman" w:cs="Times New Roman" w:eastAsia="Times New Roman" w:hAnsi="Times New Roman"/>
+        </w:rPr>
+        <w:t xml:space="preserve">6.1  Conclusion</w:t>
+      </w:r>
+    </w:p>
+    <w:p>
+      <w:pPr>
+        <w:spacing w:after="20" w:line="300" w:before="0"/>
+        <w:ind w:left="420"/>
+      </w:pPr>
+      <w:r>
+        <w:rPr>
+          <w:b w:val="false"/>
+          <w:bCs w:val="false"/>
+          <w:sz w:val="22"/>
+          <w:szCs w:val="22"/>
+          <w:rFonts w:ascii="Times New Roman" w:cs="Times New Roman" w:eastAsia="Times New Roman" w:hAnsi="Times New Roman"/>
+        </w:rPr>
+        <w:t xml:space="preserve">6.2  Limitations</w:t>
+      </w:r>
+    </w:p>
+    <w:p>
+      <w:pPr>
+        <w:spacing w:after="20" w:line="300" w:before="0"/>
+        <w:ind w:left="420"/>
+      </w:pPr>
+      <w:r>
+        <w:rPr>
+          <w:b w:val="false"/>
+          <w:bCs w:val="false"/>
+          <w:sz w:val="22"/>
+          <w:szCs w:val="22"/>
+          <w:rFonts w:ascii="Times New Roman" w:cs="Times New Roman" w:eastAsia="Times New Roman" w:hAnsi="Times New Roman"/>
+        </w:rPr>
+        <w:t xml:space="preserve">6.3  Future Work</w:t>
+      </w:r>
+    </w:p>
+    <w:p>
+      <w:pPr>
+        <w:spacing w:after="80" w:line="300" w:before="100"/>
+      </w:pPr>
+      <w:r>
+        <w:rPr>
+          <w:b/>
+          <w:bCs/>
+          <w:sz w:val="24"/>
+          <w:szCs w:val="24"/>
+          <w:rFonts w:ascii="Times New Roman" w:cs="Times New Roman" w:eastAsia="Times New Roman" w:hAnsi="Times New Roman"/>
+        </w:rPr>
+        <w:t xml:space="preserve">Chapter 7  References</w:t>
+      </w:r>
+    </w:p>
+    <w:p>
+      <w:pPr>
+        <w:spacing w:after="80" w:line="300" w:before="100"/>
+      </w:pPr>
+      <w:r>
+        <w:rPr>
+          <w:b/>
+          <w:bCs/>
+          <w:sz w:val="24"/>
+          <w:szCs w:val="24"/>
+          <w:rFonts w:ascii="Times New Roman" w:cs="Times New Roman" w:eastAsia="Times New Roman" w:hAnsi="Times New Roman"/>
+        </w:rPr>
+        <w:t xml:space="preserve">Chapter 8  Appendix</w:t>
+      </w:r>
+    </w:p>
+    <w:p>
+      <w:pPr>
+        <w:spacing w:after="20" w:line="300" w:before="0"/>
+        <w:ind w:left="420"/>
+      </w:pPr>
+      <w:r>
+        <w:rPr>
+          <w:b w:val="false"/>
+          <w:bCs w:val="false"/>
+          <w:sz w:val="22"/>
+          <w:szCs w:val="22"/>
+          <w:rFonts w:ascii="Times New Roman" w:cs="Times New Roman" w:eastAsia="Times New Roman" w:hAnsi="Times New Roman"/>
+        </w:rPr>
+        <w:t xml:space="preserve">A.  Source-Code Repository</w:t>
+      </w:r>
+    </w:p>
+    <w:p>
+      <w:pPr>
+        <w:spacing w:after="20" w:line="300" w:before="0"/>
+        <w:ind w:left="420"/>
+      </w:pPr>
+      <w:r>
+        <w:rPr>
+          <w:b w:val="false"/>
+          <w:bCs w:val="false"/>
+          <w:sz w:val="22"/>
+          <w:szCs w:val="22"/>
+          <w:rFonts w:ascii="Times New Roman" w:cs="Times New Roman" w:eastAsia="Times New Roman" w:hAnsi="Times New Roman"/>
+        </w:rPr>
+        <w:t xml:space="preserve">B.  How to Run</w:t>
+      </w:r>
+    </w:p>
+    <w:p>
+      <w:pPr>
+        <w:spacing w:after="20" w:line="300" w:before="0"/>
+        <w:ind w:left="420"/>
+      </w:pPr>
+      <w:r>
+        <w:rPr>
+          <w:b w:val="false"/>
+          <w:bCs w:val="false"/>
+          <w:sz w:val="22"/>
+          <w:szCs w:val="22"/>
+          <w:rFonts w:ascii="Times New Roman" w:cs="Times New Roman" w:eastAsia="Times New Roman" w:hAnsi="Times New Roman"/>
+        </w:rPr>
+        <w:t xml:space="preserve">C.  Project Structure</w:t>
+      </w:r>
+    </w:p>
+    <w:p>
+      <w:pPr>
+        <w:spacing w:before="200"/>
       </w:pPr>
       <w:r>
         <w:rPr>
           <w:i/>
           <w:iCs/>
+          <w:color w:val="666666"/>
           <w:sz w:val="18"/>
           <w:szCs w:val="18"/>
           <w:rFonts w:ascii="Times New Roman" w:cs="Times New Roman" w:eastAsia="Times New Roman" w:hAnsi="Times New Roman"/>
         </w:rPr>
-        <w:t xml:space="preserve">(In Microsoft Word, right-click and choose “Update Field” to populate page numbers.)</w:t>
+        <w:t xml:space="preserve">Page numbers are shown in the footer of every page. To generate a fully numbered, clickable contents automatically, open this file in Google Docs and choose Insert ▸ Table of contents, or run docs/compute_toc_pages.py on a machine with LibreOffice and rebuild.</w:t>
       </w:r>
     </w:p>
     <w:p>
@@ -1945,16 +2641,12 @@
       </w:tr>
     </w:tbl>
     <w:p>
-      <w:r>
-        <w:br w:type="page"/>
-      </w:r>
-    </w:p>
-    <w:p>
       <w:pPr>
         <w:sectPr>
+          <w:footerReference w:type="default" r:id="rId6"/>
           <w:pgSz w:w="11906" w:h="16838" w:orient="portrait"/>
           <w:pgMar w:top="1440" w:right="1440" w:bottom="1440" w:left="1440" w:header="708" w:footer="708" w:gutter="0"/>
-          <w:pgNumType/>
+          <w:pgNumType w:fmt="lowerRoman"/>
           <w:docGrid w:linePitch="360"/>
         </w:sectPr>
       </w:pPr>
@@ -2517,7 +3209,7 @@
                     </pic:cNvPicPr>
                   </pic:nvPicPr>
                   <pic:blipFill>
-                    <a:blip r:embed="rId8" cstate="none"/>
+                    <a:blip r:embed="rId9" cstate="none"/>
                     <a:srcRect/>
                     <a:stretch>
                       <a:fillRect/>
@@ -5167,7 +5859,7 @@
                     </pic:cNvPicPr>
                   </pic:nvPicPr>
                   <pic:blipFill>
-                    <a:blip r:embed="rId9" cstate="none"/>
+                    <a:blip r:embed="rId10" cstate="none"/>
                     <a:srcRect/>
                     <a:stretch>
                       <a:fillRect/>
@@ -5247,68 +5939,6 @@
             <wp:extent cx="3429000" cy="2781300"/>
             <wp:effectExtent t="0" r="0" b="0" l="0"/>
             <wp:docPr id="1" name="confusion_matrix.png" descr="Figure 5.2  Confusion matrix on the held-out test set" title="Figure 5.2  Confusion matrix on the held-out test set"/>
-            <wp:cNvGraphicFramePr>
-              <a:graphicFrameLocks xmlns:a="http://schemas.openxmlformats.org/drawingml/2006/main" noChangeAspect="1"/>
-            </wp:cNvGraphicFramePr>
-            <a:graphic xmlns:a="http://schemas.openxmlformats.org/drawingml/2006/main">
-              <a:graphicData uri="http://schemas.openxmlformats.org/drawingml/2006/picture">
-                <pic:pic xmlns:pic="http://schemas.openxmlformats.org/drawingml/2006/picture">
-                  <pic:nvPicPr>
-                    <pic:cNvPr id="0" name="" descr=""/>
-                    <pic:cNvPicPr>
-                      <a:picLocks noChangeAspect="1" noChangeArrowheads="1"/>
-                    </pic:cNvPicPr>
-                  </pic:nvPicPr>
-                  <pic:blipFill>
-                    <a:blip r:embed="rId10" cstate="none"/>
-                    <a:srcRect/>
-                    <a:stretch>
-                      <a:fillRect/>
-                    </a:stretch>
-                  </pic:blipFill>
-                  <pic:spPr bwMode="auto">
-                    <a:xfrm>
-                      <a:off x="0" y="0"/>
-                      <a:ext cx="3429000" cy="2781300"/>
-                    </a:xfrm>
-                    <a:prstGeom prst="rect">
-                      <a:avLst/>
-                    </a:prstGeom>
-                  </pic:spPr>
-                </pic:pic>
-              </a:graphicData>
-            </a:graphic>
-          </wp:inline>
-        </w:drawing>
-      </w:r>
-    </w:p>
-    <w:p>
-      <w:pPr>
-        <w:spacing w:before="60" w:after="200"/>
-        <w:jc w:val="center"/>
-      </w:pPr>
-      <w:r>
-        <w:rPr>
-          <w:i/>
-          <w:iCs/>
-          <w:sz w:val="20"/>
-          <w:szCs w:val="20"/>
-          <w:rFonts w:ascii="Times New Roman" w:cs="Times New Roman" w:eastAsia="Times New Roman" w:hAnsi="Times New Roman"/>
-        </w:rPr>
-        <w:t xml:space="preserve">Figure 5.2  Confusion matrix on the held-out test set</w:t>
-      </w:r>
-    </w:p>
-    <w:p>
-      <w:pPr>
-        <w:spacing w:before="120" w:after="40"/>
-        <w:jc w:val="center"/>
-      </w:pPr>
-      <w:r>
-        <w:drawing>
-          <wp:inline distT="0" distB="0" distL="0" distR="0">
-            <wp:extent cx="3429000" cy="2790825"/>
-            <wp:effectExtent t="0" r="0" b="0" l="0"/>
-            <wp:docPr id="1" name="roc_curve.png" descr="Figure 5.3  ROC curve on the held-out test set" title="Figure 5.3  ROC curve on the held-out test set"/>
             <wp:cNvGraphicFramePr>
               <a:graphicFrameLocks xmlns:a="http://schemas.openxmlformats.org/drawingml/2006/main" noChangeAspect="1"/>
             </wp:cNvGraphicFramePr>
@@ -5331,7 +5961,7 @@
                   <pic:spPr bwMode="auto">
                     <a:xfrm>
                       <a:off x="0" y="0"/>
-                      <a:ext cx="3429000" cy="2790825"/>
+                      <a:ext cx="3429000" cy="2781300"/>
                     </a:xfrm>
                     <a:prstGeom prst="rect">
                       <a:avLst/>
@@ -5357,38 +5987,7 @@
           <w:szCs w:val="20"/>
           <w:rFonts w:ascii="Times New Roman" w:cs="Times New Roman" w:eastAsia="Times New Roman" w:hAnsi="Times New Roman"/>
         </w:rPr>
-        <w:t xml:space="preserve">Figure 5.3  ROC curve on the held-out test set</w:t>
-      </w:r>
-    </w:p>
-    <w:p>
-      <w:pPr>
-        <w:pStyle w:val="Heading2"/>
-        <w:spacing w:before="200" w:after="120"/>
-      </w:pPr>
-      <w:r>
-        <w:rPr>
-          <w:b/>
-          <w:bCs/>
-          <w:color w:val="1F4E79"/>
-          <w:sz w:val="28"/>
-          <w:szCs w:val="28"/>
-          <w:rFonts w:ascii="Times New Roman" w:cs="Times New Roman" w:eastAsia="Times New Roman" w:hAnsi="Times New Roman"/>
-        </w:rPr>
-        <w:t xml:space="preserve">5.5  Explainability Results</w:t>
-      </w:r>
-    </w:p>
-    <w:p>
-      <w:pPr>
-        <w:spacing w:line="360" w:after="120"/>
-        <w:jc w:val="both"/>
-      </w:pPr>
-      <w:r>
-        <w:rPr>
-          <w:sz w:val="24"/>
-          <w:szCs w:val="24"/>
-          <w:rFonts w:ascii="Times New Roman" w:cs="Times New Roman" w:eastAsia="Times New Roman" w:hAnsi="Times New Roman"/>
-        </w:rPr>
-        <w:t xml:space="preserve">Figure 5.4 shows Grad-CAM overlays on sample test X-rays together with the true and predicted labels. The heatmaps concentrate on the lung fields, indicating that the model bases its decisions on clinically relevant regions rather than on irrelevant background, which supports the trustworthiness of the system.</w:t>
+        <w:t xml:space="preserve">Figure 5.2  Confusion matrix on the held-out test set</w:t>
       </w:r>
     </w:p>
     <w:p>
@@ -5399,9 +5998,9 @@
       <w:r>
         <w:drawing>
           <wp:inline distT="0" distB="0" distL="0" distR="0">
-            <wp:extent cx="5334000" cy="3686175"/>
+            <wp:extent cx="3429000" cy="2790825"/>
             <wp:effectExtent t="0" r="0" b="0" l="0"/>
-            <wp:docPr id="1" name="sample_gradcams.png" descr="Figure 5.4  Grad-CAM explanations on sample test X-rays" title="Figure 5.4  Grad-CAM explanations on sample test X-rays"/>
+            <wp:docPr id="1" name="roc_curve.png" descr="Figure 5.3  ROC curve on the held-out test set" title="Figure 5.3  ROC curve on the held-out test set"/>
             <wp:cNvGraphicFramePr>
               <a:graphicFrameLocks xmlns:a="http://schemas.openxmlformats.org/drawingml/2006/main" noChangeAspect="1"/>
             </wp:cNvGraphicFramePr>
@@ -5424,6 +6023,99 @@
                   <pic:spPr bwMode="auto">
                     <a:xfrm>
                       <a:off x="0" y="0"/>
+                      <a:ext cx="3429000" cy="2790825"/>
+                    </a:xfrm>
+                    <a:prstGeom prst="rect">
+                      <a:avLst/>
+                    </a:prstGeom>
+                  </pic:spPr>
+                </pic:pic>
+              </a:graphicData>
+            </a:graphic>
+          </wp:inline>
+        </w:drawing>
+      </w:r>
+    </w:p>
+    <w:p>
+      <w:pPr>
+        <w:spacing w:before="60" w:after="200"/>
+        <w:jc w:val="center"/>
+      </w:pPr>
+      <w:r>
+        <w:rPr>
+          <w:i/>
+          <w:iCs/>
+          <w:sz w:val="20"/>
+          <w:szCs w:val="20"/>
+          <w:rFonts w:ascii="Times New Roman" w:cs="Times New Roman" w:eastAsia="Times New Roman" w:hAnsi="Times New Roman"/>
+        </w:rPr>
+        <w:t xml:space="preserve">Figure 5.3  ROC curve on the held-out test set</w:t>
+      </w:r>
+    </w:p>
+    <w:p>
+      <w:pPr>
+        <w:pStyle w:val="Heading2"/>
+        <w:spacing w:before="200" w:after="120"/>
+      </w:pPr>
+      <w:r>
+        <w:rPr>
+          <w:b/>
+          <w:bCs/>
+          <w:color w:val="1F4E79"/>
+          <w:sz w:val="28"/>
+          <w:szCs w:val="28"/>
+          <w:rFonts w:ascii="Times New Roman" w:cs="Times New Roman" w:eastAsia="Times New Roman" w:hAnsi="Times New Roman"/>
+        </w:rPr>
+        <w:t xml:space="preserve">5.5  Explainability Results</w:t>
+      </w:r>
+    </w:p>
+    <w:p>
+      <w:pPr>
+        <w:spacing w:line="360" w:after="120"/>
+        <w:jc w:val="both"/>
+      </w:pPr>
+      <w:r>
+        <w:rPr>
+          <w:sz w:val="24"/>
+          <w:szCs w:val="24"/>
+          <w:rFonts w:ascii="Times New Roman" w:cs="Times New Roman" w:eastAsia="Times New Roman" w:hAnsi="Times New Roman"/>
+        </w:rPr>
+        <w:t xml:space="preserve">Figure 5.4 shows Grad-CAM overlays on sample test X-rays together with the true and predicted labels. The heatmaps concentrate on the lung fields, indicating that the model bases its decisions on clinically relevant regions rather than on irrelevant background, which supports the trustworthiness of the system.</w:t>
+      </w:r>
+    </w:p>
+    <w:p>
+      <w:pPr>
+        <w:spacing w:before="120" w:after="40"/>
+        <w:jc w:val="center"/>
+      </w:pPr>
+      <w:r>
+        <w:drawing>
+          <wp:inline distT="0" distB="0" distL="0" distR="0">
+            <wp:extent cx="5334000" cy="3686175"/>
+            <wp:effectExtent t="0" r="0" b="0" l="0"/>
+            <wp:docPr id="1" name="sample_gradcams.png" descr="Figure 5.4  Grad-CAM explanations on sample test X-rays" title="Figure 5.4  Grad-CAM explanations on sample test X-rays"/>
+            <wp:cNvGraphicFramePr>
+              <a:graphicFrameLocks xmlns:a="http://schemas.openxmlformats.org/drawingml/2006/main" noChangeAspect="1"/>
+            </wp:cNvGraphicFramePr>
+            <a:graphic xmlns:a="http://schemas.openxmlformats.org/drawingml/2006/main">
+              <a:graphicData uri="http://schemas.openxmlformats.org/drawingml/2006/picture">
+                <pic:pic xmlns:pic="http://schemas.openxmlformats.org/drawingml/2006/picture">
+                  <pic:nvPicPr>
+                    <pic:cNvPr id="0" name="" descr=""/>
+                    <pic:cNvPicPr>
+                      <a:picLocks noChangeAspect="1" noChangeArrowheads="1"/>
+                    </pic:cNvPicPr>
+                  </pic:nvPicPr>
+                  <pic:blipFill>
+                    <a:blip r:embed="rId13" cstate="none"/>
+                    <a:srcRect/>
+                    <a:stretch>
+                      <a:fillRect/>
+                    </a:stretch>
+                  </pic:blipFill>
+                  <pic:spPr bwMode="auto">
+                    <a:xfrm>
+                      <a:off x="0" y="0"/>
                       <a:ext cx="5334000" cy="3686175"/>
                     </a:xfrm>
                     <a:prstGeom prst="rect">
@@ -6279,62 +6971,12 @@
         <w:t xml:space="preserve">reports/figures/  training curves, confusion matrix, ROC, Grad-CAMs</w:t>
       </w:r>
     </w:p>
-    <w:p>
-      <w:r>
-        <w:t xml:space="preserve"/>
-      </w:r>
-    </w:p>
-    <w:p>
-      <w:r>
-        <w:t xml:space="preserve"/>
-      </w:r>
-    </w:p>
-    <w:p>
-      <w:pPr>
-        <w:tabs>
-          <w:tab w:val="right" w:pos="9026"/>
-        </w:tabs>
-      </w:pPr>
-      <w:r>
-        <w:rPr>
-          <w:sz w:val="24"/>
-          <w:szCs w:val="24"/>
-          <w:rFonts w:ascii="Times New Roman" w:cs="Times New Roman" w:eastAsia="Times New Roman" w:hAnsi="Times New Roman"/>
-        </w:rPr>
-        <w:t xml:space="preserve">Date:	Student Name and Signature</w:t>
-      </w:r>
-    </w:p>
-    <w:p>
-      <w:r>
-        <w:t xml:space="preserve"/>
-      </w:r>
-    </w:p>
-    <w:p>
-      <w:r>
-        <w:t xml:space="preserve"/>
-      </w:r>
-    </w:p>
-    <w:p>
-      <w:pPr>
-        <w:tabs>
-          <w:tab w:val="right" w:pos="9026"/>
-        </w:tabs>
-      </w:pPr>
-      <w:r>
-        <w:rPr>
-          <w:sz w:val="24"/>
-          <w:szCs w:val="24"/>
-          <w:rFonts w:ascii="Times New Roman" w:cs="Times New Roman" w:eastAsia="Times New Roman" w:hAnsi="Times New Roman"/>
-        </w:rPr>
-        <w:t xml:space="preserve">Date:	Name and Signature of the Evaluator</w:t>
-      </w:r>
-    </w:p>
     <w:sectPr>
-      <w:headerReference w:type="default" r:id="rId6"/>
-      <w:footerReference w:type="default" r:id="rId7"/>
+      <w:headerReference w:type="default" r:id="rId7"/>
+      <w:footerReference w:type="default" r:id="rId8"/>
       <w:pgSz w:w="11906" w:h="16838" w:orient="portrait"/>
       <w:pgMar w:top="1440" w:right="1440" w:bottom="1440" w:left="1440" w:header="708" w:footer="708" w:gutter="0"/>
-      <w:pgNumType/>
+      <w:pgNumType w:start="1" w:fmt="decimal"/>
       <w:docGrid w:linePitch="360"/>
     </w:sectPr>
   </w:body>
@@ -6346,6 +6988,27 @@
 </file>
 
 <file path=word/footer1.xml><?xml version="1.0" encoding="utf-8"?>
+<w:ftr xmlns:wpc="http://schemas.microsoft.com/office/word/2010/wordprocessingCanvas" xmlns:mc="http://schemas.openxmlformats.org/markup-compatibility/2006" xmlns:o="urn:schemas-microsoft-com:office:office" xmlns:r="http://schemas.openxmlformats.org/officeDocument/2006/relationships" xmlns:m="http://schemas.openxmlformats.org/officeDocument/2006/math" xmlns:v="urn:schemas-microsoft-com:vml" xmlns:wp14="http://schemas.microsoft.com/office/word/2010/wordprocessingDrawing" xmlns:wp="http://schemas.openxmlformats.org/drawingml/2006/wordprocessingDrawing" xmlns:w10="urn:schemas-microsoft-com:office:word" xmlns:w="http://schemas.openxmlformats.org/wordprocessingml/2006/main" xmlns:w14="http://schemas.microsoft.com/office/word/2010/wordml" xmlns:w15="http://schemas.microsoft.com/office/word/2012/wordml" xmlns:wpg="http://schemas.microsoft.com/office/word/2010/wordprocessingGroup" xmlns:wpi="http://schemas.microsoft.com/office/word/2010/wordprocessingInk" xmlns:wne="http://schemas.microsoft.com/office/word/2006/wordml" xmlns:wps="http://schemas.microsoft.com/office/word/2010/wordprocessingShape">
+  <w:p>
+    <w:pPr>
+      <w:jc w:val="center"/>
+    </w:pPr>
+    <w:r>
+      <w:rPr>
+        <w:sz w:val="18"/>
+        <w:szCs w:val="18"/>
+        <w:rFonts w:ascii="Times New Roman" w:cs="Times New Roman" w:eastAsia="Times New Roman" w:hAnsi="Times New Roman"/>
+      </w:rPr>
+      <w:fldChar w:fldCharType="begin"/>
+      <w:instrText xml:space="preserve">PAGE</w:instrText>
+      <w:fldChar w:fldCharType="separate"/>
+      <w:fldChar w:fldCharType="end"/>
+    </w:r>
+  </w:p>
+</w:ftr>
+</file>
+
+<file path=word/footer2.xml><?xml version="1.0" encoding="utf-8"?>
 <w:ftr xmlns:wpc="http://schemas.microsoft.com/office/word/2010/wordprocessingCanvas" xmlns:mc="http://schemas.openxmlformats.org/markup-compatibility/2006" xmlns:o="urn:schemas-microsoft-com:office:office" xmlns:r="http://schemas.openxmlformats.org/officeDocument/2006/relationships" xmlns:m="http://schemas.openxmlformats.org/officeDocument/2006/math" xmlns:v="urn:schemas-microsoft-com:vml" xmlns:wp14="http://schemas.microsoft.com/office/word/2010/wordprocessingDrawing" xmlns:wp="http://schemas.openxmlformats.org/drawingml/2006/wordprocessingDrawing" xmlns:w10="urn:schemas-microsoft-com:office:word" xmlns:w="http://schemas.openxmlformats.org/wordprocessingml/2006/main" xmlns:w14="http://schemas.microsoft.com/office/word/2010/wordml" xmlns:w15="http://schemas.microsoft.com/office/word/2012/wordml" xmlns:wpg="http://schemas.microsoft.com/office/word/2010/wordprocessingGroup" xmlns:wpi="http://schemas.microsoft.com/office/word/2010/wordprocessingInk" xmlns:wne="http://schemas.microsoft.com/office/word/2006/wordml" xmlns:wps="http://schemas.microsoft.com/office/word/2010/wordprocessingShape">
   <w:p>
     <w:pPr>

</xml_diff>

<commit_message>
update readme and report with github link
</commit_message>
<xml_diff>
--- a/Pneumonia_Detection_Final_Report.docx
+++ b/Pneumonia_Detection_Final_Report.docx
@@ -571,28 +571,6 @@
       </w:r>
     </w:p>
     <w:p>
-      <w:pPr>
-        <w:spacing w:line="360" w:after="120"/>
-        <w:jc w:val="left"/>
-        <w:rPr>
-          <w:i/>
-          <w:iCs/>
-          <w:sz w:val="20"/>
-          <w:szCs w:val="20"/>
-        </w:rPr>
-      </w:pPr>
-      <w:r>
-        <w:rPr>
-          <w:i/>
-          <w:iCs/>
-          <w:sz w:val="20"/>
-          <w:szCs w:val="20"/>
-          <w:rFonts w:ascii="Times New Roman" w:cs="Times New Roman" w:eastAsia="Times New Roman" w:hAnsi="Times New Roman"/>
-        </w:rPr>
-        <w:t xml:space="preserve">(Word count: approximately 240 words)</w:t>
-      </w:r>
-    </w:p>
-    <w:p>
       <w:r>
         <w:br w:type="page"/>
       </w:r>
@@ -1325,22 +1303,6 @@
           <w:rFonts w:ascii="Times New Roman" w:cs="Times New Roman" w:eastAsia="Times New Roman" w:hAnsi="Times New Roman"/>
         </w:rPr>
         <w:t xml:space="preserve">C.  Project Structure</w:t>
-      </w:r>
-    </w:p>
-    <w:p>
-      <w:pPr>
-        <w:spacing w:before="200"/>
-      </w:pPr>
-      <w:r>
-        <w:rPr>
-          <w:i/>
-          <w:iCs/>
-          <w:color w:val="666666"/>
-          <w:sz w:val="18"/>
-          <w:szCs w:val="18"/>
-          <w:rFonts w:ascii="Times New Roman" w:cs="Times New Roman" w:eastAsia="Times New Roman" w:hAnsi="Times New Roman"/>
-        </w:rPr>
-        <w:t xml:space="preserve">Page numbers are shown in the footer of every page. To generate a fully numbered, clickable contents automatically, open this file in Google Docs and choose Insert ▸ Table of contents, or run docs/compute_toc_pages.py on a machine with LibreOffice and rebuild.</w:t>
       </w:r>
     </w:p>
     <w:p>
@@ -6696,7 +6658,7 @@
           <w:szCs w:val="24"/>
           <w:rFonts w:ascii="Times New Roman" w:cs="Times New Roman" w:eastAsia="Times New Roman" w:hAnsi="Times New Roman"/>
         </w:rPr>
-        <w:t xml:space="preserve">GitHub: &lt;insert your repository URL here&gt;</w:t>
+        <w:t xml:space="preserve">GitHub: https://github.com/pavani302/mca-minor-project</w:t>
       </w:r>
     </w:p>
     <w:p>

</xml_diff>